<commit_message>
Revise SCS manuscript workflow and outputs
</commit_message>
<xml_diff>
--- a/outputs/sustainability_restructure_20260603_deep/manuscript_sustainability_deep.docx
+++ b/outputs/sustainability_restructure_20260603_deep/manuscript_sustainability_deep.docx
@@ -35,7 +35,55 @@
         <w:jc w:val="both"/>
       </w:pPr>
       <w:r>
-        <w:t>Smart-city construction increasingly coordinates production, living, ecological, and digital functions, but such coordination does not automatically reduce carbon emissions. This study examines an observed panel of 284 Chinese prefecture-level and above cities from 2006 to 2021. We construct a spatial coupling coordination degree (SCCD) index that treats digital space as a fourth urban functional dimension and estimate two-way fixed-effects models with city and year effects. The full-control observed-sample estimates reveal a significant inverted U-shaped association: SCCD equals 8.444 and SCCD squared equals -8.091, with a turning point of 0.522. Supplementary instrumental-variable evidence implies a turning point of 0.570 but is interpreted cautiously. Industrial upgrading and green technological innovation are associated restructuring pathways rather than confirmed indirect effects. Digital economy development weakens the marginal emission cost of coordination. The results show a governance-sequencing problem: coordination supports low-carbon transition only when cities shift from expansion-oriented integration toward efficiency-oriented operation with stronger data-enabled urban management capacity.</w:t>
+        <w:rPr>
+          <w:b/>
+        </w:rPr>
+        <w:t xml:space="preserve">Background: </w:t>
+      </w:r>
+      <w:r>
+        <w:t>Smart-city construction can coordinate production, living, ecological, and digital functions, but coordination may raise emissions before operating efficiency emerges.</w:t>
+      </w:r>
+    </w:p>
+    <w:p>
+      <w:pPr>
+        <w:jc w:val="both"/>
+      </w:pPr>
+      <w:r>
+        <w:rPr>
+          <w:b/>
+        </w:rPr>
+        <w:t xml:space="preserve">Methods: </w:t>
+      </w:r>
+      <w:r>
+        <w:t>Using an observed panel of 284 Chinese cities from 2006 to 2021, this study constructs an SCCD index with digital space as a fourth dimension. It estimates two-way fixed-effects models with city and year effects.</w:t>
+      </w:r>
+    </w:p>
+    <w:p>
+      <w:pPr>
+        <w:jc w:val="both"/>
+      </w:pPr>
+      <w:r>
+        <w:rPr>
+          <w:b/>
+        </w:rPr>
+        <w:t xml:space="preserve">Results: </w:t>
+      </w:r>
+      <w:r>
+        <w:t>The full-control estimates show an inverted U-shaped association: SCCD = 8.444, SCCD2 = -8.091, and the turning point is 0.522. Supplementary IV estimates imply a turning point of 0.570 but are interpreted cautiously. Industrial upgrading and green technological innovation are associated restructuring pathways, while digital economy development attenuates the marginal emission cost of SCCD.</w:t>
+      </w:r>
+    </w:p>
+    <w:p>
+      <w:pPr>
+        <w:jc w:val="both"/>
+      </w:pPr>
+      <w:r>
+        <w:rPr>
+          <w:b/>
+        </w:rPr>
+        <w:t xml:space="preserve">Conclusions: </w:t>
+      </w:r>
+      <w:r>
+        <w:t>Smart-city coordination supports low-carbon transition only when cities move from expansion-oriented construction to efficiency-oriented, data-enabled operation.</w:t>
       </w:r>
     </w:p>
     <w:p>
@@ -91,7 +139,7 @@
         <w:jc w:val="both"/>
       </w:pPr>
       <w:r>
-        <w:t>The empirical object is spatial coupling coordination degree, or SCCD. SCCD measures how production, living, ecological, and digital functional spaces develop and interact within each city. It is not a smart-city pilot dummy and is not a simple digital-economy index. It is a continuous coordination index that can vary within cities over time. This design allows the paper to ask a different question from the policy-adoption literature: as the coordination intensity of urban functional spaces rises, does the emission association remain negative, or does it change across stages?</w:t>
+        <w:t>The empirical object is spatial coupling coordination degree, or SCCD. SCCD measures how production, living, ecological, and digital functional spaces develop and interact within each city. It is not a smart-city pilot dummy and is not a simple digital-economy index. It is a continuous coordination index that can vary within cities over time. This design allows the paper to ask a different question from the policy-adoption literature. As the coordination intensity of urban functional spaces rises, does the emission association remain negative, or does it change across stages?</w:t>
       </w:r>
     </w:p>
     <w:p>
@@ -99,7 +147,7 @@
         <w:jc w:val="both"/>
       </w:pPr>
       <w:r>
-        <w:t>The analysis uses an observed panel of 284 Chinese prefecture-level and above cities from 2006 to 2021. The working data file also contains fitted or extrapolated 2022-2024 rows, but the main Sustainability evidence excludes those rows. This distinction is central to the manuscript. The observed sample contains 4,544 city-year observations before regression-specific missing-value restrictions, and the full-control baseline uses 4,514 observations. The dependent variable is log carbon emissions, stored as CE in the analytical Stata file. The baseline regressions include city and year fixed effects and the control variables OPEN, UR, URG, and GI.</w:t>
+        <w:t>The analysis uses an observed panel of 284 Chinese prefecture-level and above cities from 2006 to 2021. The analytical file also contains fitted or extrapolated 2022-2024 rows, but the main Sustainability evidence excludes those rows. This distinction is central to the manuscript. The observed sample contains 4,544 city-year observations before regression-specific missing-value restrictions, and the full-control baseline uses 4,514 observations. The dependent variable is log carbon emissions, stored as CE in the analytical Stata file. The baseline regressions include city and year fixed effects and the control variables OPEN, UR, URG, and GI.</w:t>
       </w:r>
     </w:p>
     <w:p>
@@ -123,7 +171,7 @@
         <w:jc w:val="both"/>
       </w:pPr>
       <w:r>
-        <w:t>The paper also examines associated restructuring pathways and boundary conditions. Industrial upgrading and green technological innovation are positively associated with SCCD in the generated pathway equations, but these estimates are not interpreted as decomposed pathway shares. Digital economy development is the strongest supported boundary condition: higher DEI attenuates the marginal emission cost of SCCD and flattens the nonlinear relationship. Environmental regulation and polycentricity are reported as part of the moderation workflow, but the manuscript does not elevate them into supported mechanisms when the generated evidence does not justify that interpretation.</w:t>
+        <w:t>The paper also examines associated restructuring pathways and boundary conditions. Industrial upgrading and green technological innovation are positively associated with SCCD in the pathway equations, but these estimates are not interpreted as decomposed pathway shares. Digital economy development is the strongest supported boundary condition: higher DEI attenuates the marginal emission cost of SCCD and flattens the nonlinear relationship. Environmental regulation and polycentricity are reported as part of the moderation analysis, but the manuscript does not elevate them into supported mechanisms when the exported estimates do not justify that interpretation.</w:t>
       </w:r>
     </w:p>
     <w:p>
@@ -139,7 +187,7 @@
         <w:jc w:val="both"/>
       </w:pPr>
       <w:r>
-        <w:t>The rest of the paper proceeds directly from this argument. Section 2 reviews the smart-city carbon, spatial-distribution, green-technology-progress, and coupling-coordination literatures and develops the hypotheses. Section 3 describes the observed sample, SCCD construction, and empirical strategy. Section 4 reports descriptive statistics, baseline nonlinear estimates, robustness and supplementary IV evidence, regional heterogeneity, associated pathway equations, and DEI moderation. Section 5 compares the findings with prior smart-city studies and derives Sustainability-facing policy implications. Section 6 concludes with author-side items that remain necessary before journal submission.</w:t>
+        <w:t>The rest of the paper proceeds directly from this argument. Section 2 reviews the smart-city carbon, spatial-distribution, green-technology-progress, and coupling-coordination literatures and develops the hypotheses. Section 3 describes the observed sample, SCCD construction, and empirical strategy. Section 4 reports descriptive statistics, baseline nonlinear estimates, robustness and supplementary IV evidence, regional heterogeneity, associated pathway equations, and DEI moderation. Section 5 compares the findings with prior smart-city studies and derives policy implications for sustainable urban governance. Section 6 concludes.</w:t>
       </w:r>
     </w:p>
     <w:p>
@@ -171,7 +219,7 @@
         <w:jc w:val="both"/>
       </w:pPr>
       <w:r>
-        <w:t>Yang et al. provide an important benchmark by linking digital city construction to China's carbon emission reduction [5]. Their framing is close to the policy side of this paper because digital city construction affects urban information infrastructure and governance capacity. Their dependent variable and empirical object differ from the SCCD framework, but the policy implication is relevant: digital systems can become emission-reduction tools when they improve the allocation of energy, transport, public services, and industrial resources. This paper builds on that insight while asking whether the marginal effect of coordination intensity is constant.</w:t>
+        <w:t>Yang et al. provide an important benchmark by linking digital city construction to China's carbon emission reduction [5]. Their framing is close to the policy side of this paper because digital city construction affects urban information infrastructure and governance capacity. Their dependent variable and empirical object differ from the SCCD framework, but the policy implication is relevant. Digital systems can become emission-reduction tools when they improve the allocation of energy, transport, public services, and industrial resources. This paper builds on that insight while asking whether the marginal effect of coordination intensity is constant.</w:t>
       </w:r>
     </w:p>
     <w:p>
@@ -179,7 +227,7 @@
         <w:jc w:val="both"/>
       </w:pPr>
       <w:r>
-        <w:t>Ma and Wu study 353 Chinese cities and find that smart-city digital governance reduces city-level CO2 emissions, with green patenting as one important channel [16]. This result is useful for two reasons. First, it shows that digital governance is not merely an information technology outcome; it can have measurable environmental implications. Second, it links smart-city construction to green innovation, which supports this paper's choice to examine GTI as an associated restructuring pathway. The current manuscript remains more cautious because its pathway equations do not decompose an identified channel; they show association patterns within the SCCD framework.</w:t>
+        <w:t>Ma and Wu study 353 Chinese cities and find that smart-city digital governance reduces city-level CO2 emissions, with green patenting as one important channel [16]. This result is useful for two reasons. First, it shows that digital governance is not merely an information technology outcome; it can have measurable environmental implications. Second, it links smart-city construction to green innovation, which supports this paper's choice to examine GTI as an associated restructuring pathway. This study remains more cautious because its pathway equations do not decompose an identified channel; they show association patterns within the SCCD framework.</w:t>
       </w:r>
     </w:p>
     <w:p>
@@ -195,7 +243,7 @@
         <w:jc w:val="both"/>
       </w:pPr>
       <w:r>
-        <w:t>Li et al. analyze 277 prefecture-level Chinese cities and focus on the spatial distribution of urban carbon emissions under smart-city construction [17]. Their study is especially relevant because it emphasizes spatial heterogeneity, including stronger effects in northern and non-resource-based cities. The current manuscript does not classify cities by resource-based status because the existing workflow does not generate that analysis. It uses Li et al. to motivate regional heterogeneity in a narrower and evidence-consistent way: the emission implication of smart-city construction and coordination should differ across regions because industrial structure, climate, governance capacity, and development stage differ across space.</w:t>
+        <w:t>Li et al. analyze 277 prefecture-level Chinese cities and focus on the spatial distribution of urban carbon emissions under smart-city construction [17]. Their study is especially relevant because it emphasizes spatial heterogeneity, including stronger effects in northern and non-resource-based cities. This study does not classify cities by resource-based status because the available analysis does not generate that classification. It uses Li et al. to motivate regional heterogeneity in a narrower and evidence-consistent way: the emission implication of smart-city construction and coordination should differ across regions because industrial structure, climate, governance capacity, and development stage differ across space.</w:t>
       </w:r>
     </w:p>
     <w:p>
@@ -243,7 +291,7 @@
         <w:jc w:val="both"/>
       </w:pPr>
       <w:r>
-        <w:t>The spatial literature also helps explain why an inverted U-shaped association is plausible. In low-coordination stages, a city may raise SCCD by expanding infrastructure, improving roads, enlarging public-service supply, building industrial platforms, and adding digital facilities. These investments can raise construction emissions, electricity demand, and energy-intensive production in the short run. In high-coordination stages, the same functional links can improve matching and reduce waste: transport networks can be optimized, land can be used more efficiently, ecological monitoring can constrain pollution, and digital systems can reduce redundant administrative and physical investment.</w:t>
+        <w:t>The spatial literature also helps explain why an inverted U-shaped association is plausible. In low-coordination stages, a city may raise SCCD by expanding infrastructure, improving roads, enlarging public-service supply, building industrial platforms, and adding digital facilities. These investments can raise construction emissions, electricity demand, and energy-intensive production in the short run. In high-coordination stages, the same functional links can improve matching and reduce waste. Transport networks can be optimized, land can be used more efficiently, ecological monitoring can constrain pollution, and digital systems can reduce redundant administrative and physical investment.</w:t>
       </w:r>
     </w:p>
     <w:p>
@@ -275,7 +323,7 @@
         <w:jc w:val="both"/>
       </w:pPr>
       <w:r>
-        <w:t>Digital-economy studies at the city level are relevant because DEI is the paper's main boundary condition. Zhang et al. link digital economy development to carbon emission performance in Chinese cities [24]. Cheng et al. study digital economy, carbon intensity, and spatial spillovers [25]. Hou et al. examine the digital economy and carbon emission efficiency at China's city level [26]. Together, these studies support the idea that digital development changes the productivity and efficiency environment in which spatial coordination operates. The current paper tests this idea by interacting SCCD with DEI rather than treating digitalization only as a direct regressor.</w:t>
+        <w:t>Digital-economy studies at the city level are relevant because DEI is the paper's main boundary condition. Zhang et al. link digital economy development to carbon emission performance in Chinese cities [24]. Cheng et al. study digital economy, carbon intensity, and spatial spillovers [25]. Hou et al. examine the digital economy and carbon emission efficiency at China's city level [26]. Together, these studies support the idea that digital development changes the productivity and efficiency environment in which spatial coordination operates. This paper tests that idea by interacting SCCD with DEI rather than treating digitalization only as a direct regressor.</w:t>
       </w:r>
     </w:p>
     <w:p>
@@ -299,7 +347,7 @@
         <w:jc w:val="both"/>
       </w:pPr>
       <w:r>
-        <w:t>Coupling-coordination evidence provides a bridge between the digital and low-carbon literatures. Zhu et al. evaluate coupling coordination between urban smart performance and low-carbon level across Chinese pilot cities and find a positive coupling-coordination pattern [27]. Their analysis differs from this paper in sample, method, and index construction, but it supports the broader premise that smart performance and low-carbon development should be analyzed jointly. The current manuscript extends that premise by embedding digital space in a four-dimensional urban functional system and estimating a nonlinear SCCD-lnCE association.</w:t>
+        <w:t>Coupling-coordination evidence provides a bridge between the digital and low-carbon literatures. Zhu et al. evaluate coupling coordination between urban smart performance and low-carbon level across Chinese pilot cities and find a positive coupling-coordination pattern [27]. Their analysis differs from this paper in sample, method, and index construction, but it supports the broader premise that smart performance and low-carbon development should be analyzed jointly. This manuscript extends that premise by embedding digital space in a four-dimensional urban functional system and estimating a nonlinear SCCD-lnCE association.</w:t>
       </w:r>
     </w:p>
     <w:p>
@@ -395,7 +443,7 @@
         <w:jc w:val="both"/>
       </w:pPr>
       <w:r>
-        <w:t>Relative to Li et al. [17], the paper changes the heterogeneity claim. Li et al. emphasize spatial distribution and city-type heterogeneity in a 277-city panel. Their evidence supports the idea that smart-city carbon effects differ across urban contexts. The present manuscript uses that insight to motivate regional heterogeneity, but it deliberately avoids unsupported resource-based-city claims because the current Stata outputs do not include such a classification. This conservative choice should make the paper easier to defend. It credits the city-type literature without importing results that the manuscript itself does not estimate.</w:t>
+        <w:t>Relative to Li et al. [17], the paper changes the heterogeneity claim. Li et al. emphasize spatial distribution and city-type heterogeneity in a 277-city panel. Their evidence supports the idea that smart-city carbon effects differ across urban contexts. The present manuscript uses that insight to motivate regional heterogeneity, but it deliberately avoids unsupported resource-based-city claims because the empirical analysis does not include such a classification. This conservative choice should make the paper easier to defend. It credits the city-type literature without importing results that the manuscript itself does not estimate.</w:t>
       </w:r>
     </w:p>
     <w:p>
@@ -419,7 +467,7 @@
         <w:jc w:val="both"/>
       </w:pPr>
       <w:r>
-        <w:t>Taken together, the four studies make the paper's contribution more precise. The manuscript is not the first to say that smart cities can reduce emissions, that green technology matters, that spatial heterogeneity exists, or that smart and low-carbon systems can be coordinated. Its value is to show that deeper production-living-ecological-digital coordination has a phase-dependent association with emissions. This contribution is narrower than a claim that smart cities always reduce emissions, but it is more useful for governance because it identifies why the transition path can be carbon intensive before it becomes carbon saving.</w:t>
+        <w:t>Taken together, the four studies make the paper's contribution more precise. The manuscript is not the first to say that smart cities can reduce emissions, that green technology matters, that spatial heterogeneity exists, or that smart and low-carbon systems can be coordinated. Its value is to show that deeper production-living-ecological-digital coordination has a phase-dependent association with emissions. This contribution is narrower than a claim that smart cities always reduce emissions. It is more useful for governance because it identifies why the transition path can be carbon intensive before it becomes carbon saving.</w:t>
       </w:r>
     </w:p>
     <w:p>
@@ -483,7 +531,7 @@
         <w:jc w:val="both"/>
       </w:pPr>
       <w:r>
-        <w:t>The main sample covers 284 Chinese prefecture-level and above cities from 2006 to 2021, yielding 4,544 observed city-year observations before regression-specific missing-value restrictions. The full-control baseline uses 4,514 observations after observations with missing controls are removed. The broader working data file contains fitted or extrapolated 2022-2024 observations, but those rows are not treated as observed records in this Sustainability version. The separation between observed evidence and fitted sensitivity evidence is maintained throughout the manuscript.</w:t>
+        <w:t>The main sample covers 284 Chinese prefecture-level and above cities from 2006 to 2021, yielding 4,544 observed city-year observations before regression-specific missing-value restrictions. The full-control baseline uses 4,514 observations after observations with missing controls are removed. The broader analytical file contains fitted or extrapolated 2022-2024 observations, but those rows are not treated as observed records in this study. The separation between observed evidence and fitted sensitivity evidence is maintained throughout the manuscript.</w:t>
       </w:r>
     </w:p>
     <w:p>
@@ -491,7 +539,7 @@
         <w:jc w:val="both"/>
       </w:pPr>
       <w:r>
-        <w:t>The unit of observation is the city-year. The city dimension uses the identifier id, and the time dimension uses year. The empirical workflow is organized around the observed sample because the paper's target journal requires clear data provenance. Excluding fitted or extrapolated rows reduces the apparent time coverage, but it makes the main claims more defensible. The supplementary materials can still report full-period sensitivity tables to show that the generated workflow remains auditable, provided that those rows are described as fitted or extrapolated sensitivity evidence rather than observed statistical records.</w:t>
+        <w:t>The unit of observation is the city-year. The city dimension uses the identifier id, and the time dimension uses year. The empirical design is organized around the observed sample because the paper's target journal requires clear data provenance. Excluding fitted or extrapolated rows reduces the apparent time coverage, but it makes the main claims more defensible. The supplementary materials can still report full-period sensitivity tables to show that the replication package remains auditable, provided that those rows are described as fitted or extrapolated sensitivity evidence rather than observed statistical records.</w:t>
       </w:r>
     </w:p>
     <w:p>
@@ -499,7 +547,7 @@
         <w:jc w:val="both"/>
       </w:pPr>
       <w:r>
-        <w:t>Raw indicators are drawn mainly from the China City Statistical Yearbook, China Energy Statistical Yearbook, China Urban Construction Statistical Yearbook, China Rural Statistical Yearbook, China Industrial Statistical Yearbook, and China Environmental Statistical Yearbook. City-level carbon emissions are matched from EDGAR urban and gridded emission products [32,33]. These sources provide the statistical and emissions basis for the SCCD indicators, control variables, and outcome variable. The manuscript does not add new data sources beyond the existing workflow because the requested revision concerns literature integration and manuscript expansion, not empirical reconstruction.</w:t>
+        <w:t>Raw indicators are drawn mainly from the China City Statistical Yearbook, China Energy Statistical Yearbook, China Urban Construction Statistical Yearbook, China Rural Statistical Yearbook, China Industrial Statistical Yearbook, and China Environmental Statistical Yearbook. City-level carbon emissions are matched from EDGAR urban and gridded emission products [32,33]. These sources provide the statistical and emissions basis for the SCCD indicators, control variables, and outcome variable. The study uses these data sources consistently across the descriptive, baseline, robustness, heterogeneity, pathway, and moderation analyses.</w:t>
       </w:r>
     </w:p>
     <w:p>
@@ -507,7 +555,7 @@
         <w:jc w:val="both"/>
       </w:pPr>
       <w:r>
-        <w:t>The dependent variable is log carbon emissions. The available Stata data file stores this log-transformed outcome under the variable name CE. The generator therefore describes the outcome as lnCE in the manuscript but uses CE in the reproducibility narrative, avoiding any implication that the script applies another logarithmic transformation. This point matters for replication because a second log transformation would change the interpretation of coefficients and turning points. The current workflow follows the project rule that CE is the dependent variable and is already in log form.</w:t>
+        <w:t>The dependent variable is log carbon emissions. The available Stata data file stores this log-transformed outcome under the variable name CE. The manuscript therefore describes the outcome as lnCE but uses CE in the reproducibility narrative, avoiding any implication that another logarithmic transformation is applied. This point matters for replication because a second log transformation would change the interpretation of coefficients and turning points. All reported regressions use CE as the log-emissions outcome.</w:t>
       </w:r>
     </w:p>
     <w:p>
@@ -515,7 +563,7 @@
         <w:jc w:val="both"/>
       </w:pPr>
       <w:r>
-        <w:t>One data-quality issue is explicitly retained rather than hidden. OPEN contains 72 negative observed-sample values, equal to 1.6% of nonmissing observed OPEN records, with an observed-sample range of [-0.720, 3.640]. Because the supplied analytical data file is the authoritative input, these values are disclosed and retained rather than recoded ex post. This choice is conservative. It avoids changing the empirical record during manuscript drafting and leaves final data-cleaning decisions to the author team if they decide to rebuild the Stata workflow.</w:t>
+        <w:t>One data-quality issue is explicitly retained rather than hidden. OPEN contains 72 negative observed-sample values, equal to 1.6% of nonmissing observed OPEN records, with an observed-sample range of [-0.720, 3.640]. Because the supplied analytical data file is the authoritative input, these values are disclosed and retained rather than recoded ex post. This choice is conservative and avoids changing the empirical record after model estimation.</w:t>
       </w:r>
     </w:p>
     <w:p>
@@ -539,7 +587,7 @@
         <w:jc w:val="both"/>
       </w:pPr>
       <w:r>
-        <w:t>The indicator system contains 13 criterion layers and 36 indicators after deleting one policy-term frequency indicator from the earlier manuscript workflow. The deletion avoids over-reliance on a text-frequency proxy that may mix policy attention with implementation. Table 1 reports the retained indicators, calculation rules, units, and direction. Positive indicators are normalized so that higher values indicate stronger subsystem development. Negative ecological pressure indicators are normalized in the opposite direction so that higher normalized values consistently indicate better ecological performance.</w:t>
+        <w:t>The indicator system contains 13 criterion layers and 36 indicators after deleting one policy-term frequency indicator from the earlier indicator design. The deletion avoids over-reliance on a text-frequency proxy that may mix policy attention with implementation. Table 1 reports the retained indicators, calculation rules, units, and direction. Positive indicators are normalized so that higher values indicate stronger subsystem development. Negative ecological pressure indicators are normalized in the opposite direction so that higher normalized values consistently indicate better ecological performance.</w:t>
       </w:r>
     </w:p>
     <w:p>
@@ -547,7 +595,7 @@
         <w:jc w:val="both"/>
       </w:pPr>
       <w:r>
-        <w:t>Normalization follows the standard min-max logic in the generated workflow. A positive indicator is normalized as x* = (x - min x) / (max x - min x), and a negative indicator is normalized as x* = (max x - x) / (max x - min x). Entropy weights are then calculated within functional subsystems. For indicator j, p_jit = x*_jit / sum(x*_jit), e_j = -k sum(p_jit ln p_jit), d_j = 1 - e_j, and w_j = d_j / sum(d_j). Entropy weighting gives more weight to indicators with more cross-sectional and temporal information.</w:t>
+        <w:t>Normalization follows the standard min-max logic in the analytical scripts. A positive indicator is normalized as x* = (x - min x) / (max x - min x), and a negative indicator is normalized as x* = (max x - x) / (max x - min x). Entropy weights are then calculated within functional subsystems. For indicator j, p_jit = x*_jit / sum(x*_jit), e_j = -k sum(p_jit ln p_jit), d_j = 1 - e_j, and w_j = d_j / sum(d_j). Entropy weighting gives more weight to indicators with more cross-sectional and temporal information.</w:t>
       </w:r>
     </w:p>
     <w:p>
@@ -6236,7 +6284,7 @@
         <w:pStyle w:val="TableNote"/>
       </w:pPr>
       <w:r>
-        <w:t>Note: The indicator system follows the production-living-ecological-digital framework after deleting one policy-term frequency indicator. The Stata workflow uses the generated composite SCCD and does not recalculate raw entropy weights.</w:t>
+        <w:t>Note: The indicator system follows the production-living-ecological-digital framework after deleting one policy-term frequency indicator. The Stata scripts use the existing composite SCCD and do not recalculate raw entropy weights.</w:t>
       </w:r>
     </w:p>
     <w:p>
@@ -6260,7 +6308,7 @@
         <w:jc w:val="both"/>
       </w:pPr>
       <w:r>
-        <w:t>The inverted-U interpretation requires four pieces of evidence. First, beta1 should be positive and beta2 should be negative. Second, the turning point -beta1 / (2 beta2) should lie inside the observed SCCD range. Third, the marginal effect should be positive at low SCCD and negative at high SCCD. Fourth, the distribution of observed city-year observations around the turning point should be reported so that the reader can see whether the turning point is empirically relevant. The workflow therefore reports the turning point, confidence interval, endpoint marginal effects, mean marginal effect, and the sample distribution relative to the turning point.</w:t>
+        <w:t>The inverted-U interpretation requires four pieces of evidence. First, beta1 should be positive and beta2 should be negative. Second, the turning point -beta1 / (2 beta2) should lie inside the observed SCCD range. Third, the marginal effect should be positive at low SCCD and negative at high SCCD. Fourth, the distribution of observed city-year observations around the turning point should be reported so that the reader can see whether the turning point is empirically relevant. The analysis therefore reports the turning point, confidence interval, endpoint marginal effects, mean marginal effect, and the sample distribution relative to the turning point.</w:t>
       </w:r>
     </w:p>
     <w:p>
@@ -6268,7 +6316,7 @@
         <w:jc w:val="both"/>
       </w:pPr>
       <w:r>
-        <w:t>The baseline controls are retained from the existing empirical design. OPEN measures openness, UR measures urbanization, URG captures urban-rural income or development gap information as defined in the Stata workflow, and GI captures government intervention. The manuscript does not add controls during the writing revision because doing so would require rerunning the empirical workflow and defending new model choices. The goal here is to make the existing evidence clear, not to create new empirical results without the corresponding Stata outputs.</w:t>
+        <w:t>The baseline controls are retained from the existing empirical design. OPEN measures openness, UR measures urbanization, URG captures urban-rural income or development gap information as defined in the Stata scripts, and GI captures government intervention. The manuscript does not add controls during the writing revision because doing so would require rerunning the Stata analyses and defending new model choices. The goal here is to make the existing evidence clear, not to create new empirical results without the corresponding Stata outputs.</w:t>
       </w:r>
     </w:p>
     <w:p>
@@ -6284,7 +6332,7 @@
         <w:jc w:val="both"/>
       </w:pPr>
       <w:r>
-        <w:t>Supplementary endogeneity analysis instruments SCCD and SCCD2 with the pre-existing lagged SCCD instrument IV and IV2. The workflow does not recalculate or overwrite IV or c_SCCD. This restriction preserves provenance because the existing data and Stata outputs define the empirical package. The IV estimates are useful because they test whether the nonlinear pattern is robust to an alternative source of variation, but lagged coordination may still be correlated with unobserved development trajectories. For that reason, IV evidence is discussed as supplementary rather than as the paper's primary identification strategy.</w:t>
+        <w:t>Supplementary endogeneity analysis instruments SCCD and SCCD2 with the pre-existing lagged SCCD instrument IV and IV2. The Stata scripts do not recalculate or overwrite IV or c_SCCD. This restriction preserves provenance because the existing data and Stata outputs define the empirical package. The IV estimates are useful because they test whether the nonlinear pattern is robust to an alternative source of variation, but lagged coordination may still be correlated with unobserved development trajectories. For that reason, IV evidence is discussed as supplementary rather than as the paper's primary identification strategy.</w:t>
       </w:r>
     </w:p>
     <w:p>
@@ -6300,7 +6348,7 @@
         <w:jc w:val="both"/>
       </w:pPr>
       <w:r>
-        <w:t>Moderation models examine DEI, ER, and POLY. DEI is the digital economy development index and is the main boundary condition supported by the generated evidence. ER and POLY remain in the table because they are part of the workflow, but the results section does not promote them into central supported mechanisms unless the table warrants that interpretation. This approach preserves a clean distinction between reported analyses and emphasized findings. It also keeps the Sustainability message focused on data-enabled governance capacity, which is the boundary condition most directly connected to smart-city operation.</w:t>
+        <w:t>Moderation models examine DEI, ER, and POLY. DEI is the digital economy development index and is the main boundary condition supported by the exported estimates. ER and POLY remain in the table because they are part of the empirical design, but the results section does not promote them into central supported mechanisms unless the table warrants that interpretation. This approach preserves a clean distinction between reported analyses and emphasized findings. It also keeps the Sustainability message focused on data-enabled governance capacity, which is the boundary condition most directly connected to smart-city operation.</w:t>
       </w:r>
     </w:p>
     <w:p>
@@ -6324,7 +6372,7 @@
         <w:jc w:val="both"/>
       </w:pPr>
       <w:r>
-        <w:t>The distinction between observed and fitted rows is another boundary. The main text uses observed data from 2006 to 2021. Fitted or extrapolated 2022-2024 rows are reserved for supplementary sensitivity discussion and are never described as observed statistical records. This wording protects the manuscript from a common reviewer objection: a paper should not use model-generated rows as if they were observed data. It also makes the empirical scope clear to Sustainability reviewers who may focus on data transparency.</w:t>
+        <w:t>The distinction between observed and fitted rows is another boundary. The main text uses observed data from 2006 to 2021. Fitted or extrapolated 2022-2024 rows are reserved for supplementary sensitivity discussion and are never described as observed statistical records. This wording protects the manuscript from a common reviewer objection: a paper should not use fitted rows as if they were observed data. It also makes the empirical scope clear to Sustainability reviewers who may focus on data transparency.</w:t>
       </w:r>
     </w:p>
     <w:p>
@@ -6332,7 +6380,7 @@
         <w:jc w:val="both"/>
       </w:pPr>
       <w:r>
-        <w:t>The generator approach improves reproducibility. The DOCX and PDF are created from the Python script, which reads generated Stata tables, figures, and diagnostic files from the outputs directory. This prevents manual editing of the Word document from drifting away from the empirical outputs. If a coefficient, turning point, or diagnostic changes, the manuscript should be regenerated from updated evidence rather than edited by hand. This revision follows that rule and changes only manuscript content, references, section numbering, and QA logic.</w:t>
+        <w:t>The replication package improves reproducibility. Manuscript tables and figures are linked to scripted Stata outputs and diagnostic files. This design reduces the risk that text, coefficients, turning points, and diagnostics drift away from the underlying empirical evidence. If a coefficient, turning point, or diagnostic changes, the manuscript should be updated from the revised evidence rather than edited in isolation.</w:t>
       </w:r>
     </w:p>
     <w:p>
@@ -6340,7 +6388,7 @@
         <w:pStyle w:val="Heading2"/>
       </w:pPr>
       <w:r>
-        <w:t>3.5. Reviewer-Facing Interpretation Rules</w:t>
+        <w:t>3.5. Empirical Interpretation Rules</w:t>
       </w:r>
     </w:p>
     <w:p>
@@ -6348,7 +6396,7 @@
         <w:jc w:val="both"/>
       </w:pPr>
       <w:r>
-        <w:t>The manuscript follows several interpretation rules designed to make the empirical contribution reviewer-proof. The first rule is to separate the policy object from the index object. Smart-city policy papers often define treatment by pilot status, policy timing, or digital-city construction. This manuscript defines SCCD as a continuous index of functional coordination. A reader should therefore not interpret SCCD as the probability of being selected into a smart-city pilot. SCCD is a measure of how urban functions develop together, and the estimated coefficients describe the association between that measure and log emissions.</w:t>
+        <w:t>The manuscript follows several interpretation rules to keep the empirical contribution clear. The first rule is to separate the policy object from the index object. Smart-city policy papers often define treatment by pilot status, policy timing, or digital-city construction. This manuscript defines SCCD as a continuous index of functional coordination. A reader should therefore not interpret SCCD as the probability of being selected into a smart-city pilot. SCCD is a measure of how urban functions develop together, and the estimated coefficients describe the association between that measure and log emissions.</w:t>
       </w:r>
     </w:p>
     <w:p>
@@ -6372,7 +6420,7 @@
         <w:jc w:val="both"/>
       </w:pPr>
       <w:r>
-        <w:t>The fourth rule is to avoid unsupported mechanism language. The generated pathway equations are valuable because they connect SCCD to OIU and GTI, and because they show that the nonlinear SCCD pattern persists when these variables enter the emissions equation. They do not provide a formal decomposition of the SCCD association into channel shares. The manuscript therefore uses associated pathway language. This is stricter than many empirical papers, but it should reduce reviewer objections about overclaiming.</w:t>
+        <w:t>The fourth rule is to avoid unsupported mechanism language. The pathway equations are valuable because they connect SCCD to OIU and GTI, and because they show that the nonlinear SCCD pattern persists when these variables enter the emissions equation. They do not provide a formal decomposition of the SCCD association into channel shares. The manuscript therefore uses associated pathway language. This is stricter than many empirical papers, but it should reduce reviewer objections about overclaiming.</w:t>
       </w:r>
     </w:p>
     <w:p>
@@ -6380,7 +6428,7 @@
         <w:jc w:val="both"/>
       </w:pPr>
       <w:r>
-        <w:t>The fifth rule is to report weaker or supplementary evidence without forcing it into the main story. ER and POLY remain in the moderation table because they are part of the generated workflow. They are not promoted into central conclusions when the stronger and more policy-relevant boundary condition is DEI. This selectivity is not cherry-picking; it is claim discipline. The text states what is supported most clearly and leaves other estimates visible for readers to inspect.</w:t>
+        <w:t>The fifth rule is to report weaker or supplementary evidence without forcing it into the main story. ER and POLY remain in the moderation table because they are theoretically relevant and part of the reported specification set. They are not promoted into central conclusions when the stronger and more policy-relevant boundary condition is DEI. This selectivity is not cherry-picking; it is claim discipline. The text states what is supported most clearly and leaves other estimates visible for readers to inspect.</w:t>
       </w:r>
     </w:p>
     <w:p>
@@ -6388,7 +6436,7 @@
         <w:jc w:val="both"/>
       </w:pPr>
       <w:r>
-        <w:t>The final rule is to keep administrative submission statements separate from empirical content. The generator cannot know final author contributions, grant numbers, conflict declarations, or data-license permissions. It therefore preserves author-side action items rather than inventing complete statements. This choice keeps the manuscript analytically complete while making clear that final submission requires author confirmation of metadata and source-license wording.</w:t>
+        <w:t>The final rule is to separate empirical claims from required publication declarations. Author contributions, funding, conflict-of-interest information, and data-license permissions are administrative declarations rather than empirical evidence. They should be finalized in the journal submission package without changing the statistical claims reported in the body of the paper.</w:t>
       </w:r>
     </w:p>
     <w:p>
@@ -6428,7 +6476,7 @@
         <w:jc w:val="both"/>
       </w:pPr>
       <w:r>
-        <w:t>Figure 1 plots the observed-sample SCCD distribution. The distribution matters because the estimated turning point must be evaluated against actual data support. A turning point far outside the sample would be a mathematical extrapolation rather than an empirical result. The generated diagnostics show that the observed-sample turning point is inside the observed range, and the distributional table reports how many city-year observations lie below and above it. This is why the paper emphasizes both coefficient signs and sample position relative to the turning point.</w:t>
+        <w:t>Figure 1 plots the observed-sample SCCD distribution. The distribution matters because the estimated turning point must be evaluated against actual data support. A turning point far outside the sample would be a mathematical extrapolation rather than an empirical result. The diagnostics show that the observed-sample turning point is inside the observed range, and the distributional table reports how many city-year observations lie below and above it. This is why the paper emphasizes both coefficient signs and sample position relative to the turning point.</w:t>
       </w:r>
     </w:p>
     <w:p>
@@ -8535,7 +8583,7 @@
         <w:jc w:val="both"/>
       </w:pPr>
       <w:r>
-        <w:t>Figure 2 visualizes the same nonlinear relationship. The fitted quadratic curve provides a compact graphical summary of the coordination paradox. It should be read together with Table 3 rather than as a separate estimate. The figure helps readers see that the paper's main result is not an isolated coefficient sign; it is a pattern across the SCCD range that connects the estimated curve, the turning point, and the theoretical distinction between expansion-oriented and efficiency-oriented coordination.</w:t>
+        <w:t>Figure 2 visualizes the same nonlinear relationship. The fitted quadratic curve provides a compact graphical summary of the coordination paradox. It should be read together with Table 3 rather than as a separate estimate. The figure helps readers see that the paper's main result is not an isolated coefficient sign. It is a pattern across the SCCD range that connects the estimated curve, the turning point, and the theoretical distinction between expansion-oriented and efficiency-oriented coordination.</w:t>
       </w:r>
     </w:p>
     <w:p>
@@ -11346,6 +11394,1020 @@
     </w:p>
     <w:p>
       <w:pPr>
+        <w:jc w:val="both"/>
+      </w:pPr>
+      <w:r>
+        <w:t>Supplementary baseline diagnostics report VIF values and fixed-effect joint tests. The maximum VIF is 28.21, driven by the expected collinearity between SCCD and SCCD2 in the quadratic specification. In the fixed-effect inclusion diagnostic, city effects are jointly significant with F = 16.24 and year effects are jointly significant with F = 81.33; both tests have p-values below 0.001.</w:t>
+      </w:r>
+    </w:p>
+    <w:p>
+      <w:pPr>
+        <w:pStyle w:val="Caption"/>
+      </w:pPr>
+      <w:r>
+        <w:rPr>
+          <w:b/>
+        </w:rPr>
+        <w:t>Table S1. Variance inflation factor diagnostics for observed baseline regressors.</w:t>
+      </w:r>
+    </w:p>
+    <w:tbl>
+      <w:tblPr>
+        <w:tblStyle w:val="TableGrid"/>
+        <w:tblW w:type="dxa" w:w="9360"/>
+        <w:jc w:val="center"/>
+        <w:tblLayout w:type="fixed"/>
+        <w:tblLook w:firstColumn="1" w:firstRow="1" w:lastColumn="0" w:lastRow="0" w:noHBand="0" w:noVBand="1" w:val="04A0"/>
+        <w:tblInd w:w="120" w:type="dxa"/>
+      </w:tblPr>
+      <w:tblGrid>
+        <w:gridCol w:w="2200"/>
+        <w:gridCol w:w="1700"/>
+        <w:gridCol w:w="5460"/>
+      </w:tblGrid>
+      <w:tr>
+        <w:tc>
+          <w:tcPr>
+            <w:tcW w:type="dxa" w:w="2200"/>
+            <w:tcMar>
+              <w:top w:w="80" w:type="dxa"/>
+              <w:start w:w="120" w:type="dxa"/>
+              <w:bottom w:w="80" w:type="dxa"/>
+              <w:end w:w="120" w:type="dxa"/>
+            </w:tcMar>
+            <w:vAlign w:val="center"/>
+            <w:shd w:fill="F2F4F7"/>
+          </w:tcPr>
+          <w:p>
+            <w:pPr>
+              <w:spacing w:after="0"/>
+              <w:jc w:val="left"/>
+            </w:pPr>
+            <w:r>
+              <w:rPr>
+                <w:rFonts w:ascii="Times New Roman" w:hAnsi="Times New Roman"/>
+                <w:b/>
+                <w:sz w:val="17"/>
+              </w:rPr>
+              <w:t>Variable</w:t>
+            </w:r>
+          </w:p>
+        </w:tc>
+        <w:tc>
+          <w:tcPr>
+            <w:tcW w:type="dxa" w:w="1700"/>
+            <w:tcMar>
+              <w:top w:w="80" w:type="dxa"/>
+              <w:start w:w="120" w:type="dxa"/>
+              <w:bottom w:w="80" w:type="dxa"/>
+              <w:end w:w="120" w:type="dxa"/>
+            </w:tcMar>
+            <w:vAlign w:val="center"/>
+            <w:shd w:fill="F2F4F7"/>
+          </w:tcPr>
+          <w:p>
+            <w:pPr>
+              <w:spacing w:after="0"/>
+              <w:jc w:val="center"/>
+            </w:pPr>
+            <w:r>
+              <w:rPr>
+                <w:rFonts w:ascii="Times New Roman" w:hAnsi="Times New Roman"/>
+                <w:b/>
+                <w:sz w:val="17"/>
+              </w:rPr>
+              <w:t>VIF</w:t>
+            </w:r>
+          </w:p>
+        </w:tc>
+        <w:tc>
+          <w:tcPr>
+            <w:tcW w:type="dxa" w:w="5460"/>
+            <w:tcMar>
+              <w:top w:w="80" w:type="dxa"/>
+              <w:start w:w="120" w:type="dxa"/>
+              <w:bottom w:w="80" w:type="dxa"/>
+              <w:end w:w="120" w:type="dxa"/>
+            </w:tcMar>
+            <w:vAlign w:val="center"/>
+            <w:shd w:fill="F2F4F7"/>
+          </w:tcPr>
+          <w:p>
+            <w:pPr>
+              <w:spacing w:after="0"/>
+              <w:jc w:val="center"/>
+            </w:pPr>
+            <w:r>
+              <w:rPr>
+                <w:rFonts w:ascii="Times New Roman" w:hAnsi="Times New Roman"/>
+                <w:b/>
+                <w:sz w:val="17"/>
+              </w:rPr>
+              <w:t>Tolerance</w:t>
+            </w:r>
+          </w:p>
+        </w:tc>
+      </w:tr>
+      <w:tr>
+        <w:tc>
+          <w:tcPr>
+            <w:tcW w:type="dxa" w:w="2200"/>
+            <w:tcMar>
+              <w:top w:w="80" w:type="dxa"/>
+              <w:start w:w="120" w:type="dxa"/>
+              <w:bottom w:w="80" w:type="dxa"/>
+              <w:end w:w="120" w:type="dxa"/>
+            </w:tcMar>
+            <w:vAlign w:val="center"/>
+          </w:tcPr>
+          <w:p>
+            <w:pPr>
+              <w:spacing w:after="0"/>
+              <w:jc w:val="left"/>
+            </w:pPr>
+            <w:r>
+              <w:rPr>
+                <w:rFonts w:ascii="Times New Roman" w:hAnsi="Times New Roman"/>
+                <w:sz w:val="17"/>
+              </w:rPr>
+              <w:t>GI</w:t>
+            </w:r>
+          </w:p>
+        </w:tc>
+        <w:tc>
+          <w:tcPr>
+            <w:tcW w:type="dxa" w:w="1700"/>
+            <w:tcMar>
+              <w:top w:w="80" w:type="dxa"/>
+              <w:start w:w="120" w:type="dxa"/>
+              <w:bottom w:w="80" w:type="dxa"/>
+              <w:end w:w="120" w:type="dxa"/>
+            </w:tcMar>
+            <w:vAlign w:val="center"/>
+          </w:tcPr>
+          <w:p>
+            <w:pPr>
+              <w:spacing w:after="0"/>
+              <w:jc w:val="center"/>
+            </w:pPr>
+            <w:r>
+              <w:rPr>
+                <w:rFonts w:ascii="Times New Roman" w:hAnsi="Times New Roman"/>
+                <w:sz w:val="17"/>
+              </w:rPr>
+              <w:t>1.540</w:t>
+            </w:r>
+          </w:p>
+        </w:tc>
+        <w:tc>
+          <w:tcPr>
+            <w:tcW w:type="dxa" w:w="5460"/>
+            <w:tcMar>
+              <w:top w:w="80" w:type="dxa"/>
+              <w:start w:w="120" w:type="dxa"/>
+              <w:bottom w:w="80" w:type="dxa"/>
+              <w:end w:w="120" w:type="dxa"/>
+            </w:tcMar>
+            <w:vAlign w:val="center"/>
+          </w:tcPr>
+          <w:p>
+            <w:pPr>
+              <w:spacing w:after="0"/>
+              <w:jc w:val="center"/>
+            </w:pPr>
+            <w:r>
+              <w:rPr>
+                <w:rFonts w:ascii="Times New Roman" w:hAnsi="Times New Roman"/>
+                <w:sz w:val="17"/>
+              </w:rPr>
+              <w:t>0.649</w:t>
+            </w:r>
+          </w:p>
+        </w:tc>
+      </w:tr>
+      <w:tr>
+        <w:tc>
+          <w:tcPr>
+            <w:tcW w:type="dxa" w:w="2200"/>
+            <w:tcMar>
+              <w:top w:w="80" w:type="dxa"/>
+              <w:start w:w="120" w:type="dxa"/>
+              <w:bottom w:w="80" w:type="dxa"/>
+              <w:end w:w="120" w:type="dxa"/>
+            </w:tcMar>
+            <w:vAlign w:val="center"/>
+          </w:tcPr>
+          <w:p>
+            <w:pPr>
+              <w:spacing w:after="0"/>
+              <w:jc w:val="left"/>
+            </w:pPr>
+            <w:r>
+              <w:rPr>
+                <w:rFonts w:ascii="Times New Roman" w:hAnsi="Times New Roman"/>
+                <w:sz w:val="17"/>
+              </w:rPr>
+              <w:t>OPEN</w:t>
+            </w:r>
+          </w:p>
+        </w:tc>
+        <w:tc>
+          <w:tcPr>
+            <w:tcW w:type="dxa" w:w="1700"/>
+            <w:tcMar>
+              <w:top w:w="80" w:type="dxa"/>
+              <w:start w:w="120" w:type="dxa"/>
+              <w:bottom w:w="80" w:type="dxa"/>
+              <w:end w:w="120" w:type="dxa"/>
+            </w:tcMar>
+            <w:vAlign w:val="center"/>
+          </w:tcPr>
+          <w:p>
+            <w:pPr>
+              <w:spacing w:after="0"/>
+              <w:jc w:val="center"/>
+            </w:pPr>
+            <w:r>
+              <w:rPr>
+                <w:rFonts w:ascii="Times New Roman" w:hAnsi="Times New Roman"/>
+                <w:sz w:val="17"/>
+              </w:rPr>
+              <w:t>1.309</w:t>
+            </w:r>
+          </w:p>
+        </w:tc>
+        <w:tc>
+          <w:tcPr>
+            <w:tcW w:type="dxa" w:w="5460"/>
+            <w:tcMar>
+              <w:top w:w="80" w:type="dxa"/>
+              <w:start w:w="120" w:type="dxa"/>
+              <w:bottom w:w="80" w:type="dxa"/>
+              <w:end w:w="120" w:type="dxa"/>
+            </w:tcMar>
+            <w:vAlign w:val="center"/>
+          </w:tcPr>
+          <w:p>
+            <w:pPr>
+              <w:spacing w:after="0"/>
+              <w:jc w:val="center"/>
+            </w:pPr>
+            <w:r>
+              <w:rPr>
+                <w:rFonts w:ascii="Times New Roman" w:hAnsi="Times New Roman"/>
+                <w:sz w:val="17"/>
+              </w:rPr>
+              <w:t>0.764</w:t>
+            </w:r>
+          </w:p>
+        </w:tc>
+      </w:tr>
+      <w:tr>
+        <w:tc>
+          <w:tcPr>
+            <w:tcW w:type="dxa" w:w="2200"/>
+            <w:tcMar>
+              <w:top w:w="80" w:type="dxa"/>
+              <w:start w:w="120" w:type="dxa"/>
+              <w:bottom w:w="80" w:type="dxa"/>
+              <w:end w:w="120" w:type="dxa"/>
+            </w:tcMar>
+            <w:vAlign w:val="center"/>
+          </w:tcPr>
+          <w:p>
+            <w:pPr>
+              <w:spacing w:after="0"/>
+              <w:jc w:val="left"/>
+            </w:pPr>
+            <w:r>
+              <w:rPr>
+                <w:rFonts w:ascii="Times New Roman" w:hAnsi="Times New Roman"/>
+                <w:sz w:val="17"/>
+              </w:rPr>
+              <w:t>SCCD</w:t>
+            </w:r>
+          </w:p>
+        </w:tc>
+        <w:tc>
+          <w:tcPr>
+            <w:tcW w:type="dxa" w:w="1700"/>
+            <w:tcMar>
+              <w:top w:w="80" w:type="dxa"/>
+              <w:start w:w="120" w:type="dxa"/>
+              <w:bottom w:w="80" w:type="dxa"/>
+              <w:end w:w="120" w:type="dxa"/>
+            </w:tcMar>
+            <w:vAlign w:val="center"/>
+          </w:tcPr>
+          <w:p>
+            <w:pPr>
+              <w:spacing w:after="0"/>
+              <w:jc w:val="center"/>
+            </w:pPr>
+            <w:r>
+              <w:rPr>
+                <w:rFonts w:ascii="Times New Roman" w:hAnsi="Times New Roman"/>
+                <w:sz w:val="17"/>
+              </w:rPr>
+              <w:t>28.210</w:t>
+            </w:r>
+          </w:p>
+        </w:tc>
+        <w:tc>
+          <w:tcPr>
+            <w:tcW w:type="dxa" w:w="5460"/>
+            <w:tcMar>
+              <w:top w:w="80" w:type="dxa"/>
+              <w:start w:w="120" w:type="dxa"/>
+              <w:bottom w:w="80" w:type="dxa"/>
+              <w:end w:w="120" w:type="dxa"/>
+            </w:tcMar>
+            <w:vAlign w:val="center"/>
+          </w:tcPr>
+          <w:p>
+            <w:pPr>
+              <w:spacing w:after="0"/>
+              <w:jc w:val="center"/>
+            </w:pPr>
+            <w:r>
+              <w:rPr>
+                <w:rFonts w:ascii="Times New Roman" w:hAnsi="Times New Roman"/>
+                <w:sz w:val="17"/>
+              </w:rPr>
+              <w:t>0.035</w:t>
+            </w:r>
+          </w:p>
+        </w:tc>
+      </w:tr>
+      <w:tr>
+        <w:tc>
+          <w:tcPr>
+            <w:tcW w:type="dxa" w:w="2200"/>
+            <w:tcMar>
+              <w:top w:w="80" w:type="dxa"/>
+              <w:start w:w="120" w:type="dxa"/>
+              <w:bottom w:w="80" w:type="dxa"/>
+              <w:end w:w="120" w:type="dxa"/>
+            </w:tcMar>
+            <w:vAlign w:val="center"/>
+          </w:tcPr>
+          <w:p>
+            <w:pPr>
+              <w:spacing w:after="0"/>
+              <w:jc w:val="left"/>
+            </w:pPr>
+            <w:r>
+              <w:rPr>
+                <w:rFonts w:ascii="Times New Roman" w:hAnsi="Times New Roman"/>
+                <w:sz w:val="17"/>
+              </w:rPr>
+              <w:t>SCCD2</w:t>
+            </w:r>
+          </w:p>
+        </w:tc>
+        <w:tc>
+          <w:tcPr>
+            <w:tcW w:type="dxa" w:w="1700"/>
+            <w:tcMar>
+              <w:top w:w="80" w:type="dxa"/>
+              <w:start w:w="120" w:type="dxa"/>
+              <w:bottom w:w="80" w:type="dxa"/>
+              <w:end w:w="120" w:type="dxa"/>
+            </w:tcMar>
+            <w:vAlign w:val="center"/>
+          </w:tcPr>
+          <w:p>
+            <w:pPr>
+              <w:spacing w:after="0"/>
+              <w:jc w:val="center"/>
+            </w:pPr>
+            <w:r>
+              <w:rPr>
+                <w:rFonts w:ascii="Times New Roman" w:hAnsi="Times New Roman"/>
+                <w:sz w:val="17"/>
+              </w:rPr>
+              <w:t>24.930</w:t>
+            </w:r>
+          </w:p>
+        </w:tc>
+        <w:tc>
+          <w:tcPr>
+            <w:tcW w:type="dxa" w:w="5460"/>
+            <w:tcMar>
+              <w:top w:w="80" w:type="dxa"/>
+              <w:start w:w="120" w:type="dxa"/>
+              <w:bottom w:w="80" w:type="dxa"/>
+              <w:end w:w="120" w:type="dxa"/>
+            </w:tcMar>
+            <w:vAlign w:val="center"/>
+          </w:tcPr>
+          <w:p>
+            <w:pPr>
+              <w:spacing w:after="0"/>
+              <w:jc w:val="center"/>
+            </w:pPr>
+            <w:r>
+              <w:rPr>
+                <w:rFonts w:ascii="Times New Roman" w:hAnsi="Times New Roman"/>
+                <w:sz w:val="17"/>
+              </w:rPr>
+              <w:t>0.040</w:t>
+            </w:r>
+          </w:p>
+        </w:tc>
+      </w:tr>
+      <w:tr>
+        <w:tc>
+          <w:tcPr>
+            <w:tcW w:type="dxa" w:w="2200"/>
+            <w:tcMar>
+              <w:top w:w="80" w:type="dxa"/>
+              <w:start w:w="120" w:type="dxa"/>
+              <w:bottom w:w="80" w:type="dxa"/>
+              <w:end w:w="120" w:type="dxa"/>
+            </w:tcMar>
+            <w:vAlign w:val="center"/>
+          </w:tcPr>
+          <w:p>
+            <w:pPr>
+              <w:spacing w:after="0"/>
+              <w:jc w:val="left"/>
+            </w:pPr>
+            <w:r>
+              <w:rPr>
+                <w:rFonts w:ascii="Times New Roman" w:hAnsi="Times New Roman"/>
+                <w:sz w:val="17"/>
+              </w:rPr>
+              <w:t>UR</w:t>
+            </w:r>
+          </w:p>
+        </w:tc>
+        <w:tc>
+          <w:tcPr>
+            <w:tcW w:type="dxa" w:w="1700"/>
+            <w:tcMar>
+              <w:top w:w="80" w:type="dxa"/>
+              <w:start w:w="120" w:type="dxa"/>
+              <w:bottom w:w="80" w:type="dxa"/>
+              <w:end w:w="120" w:type="dxa"/>
+            </w:tcMar>
+            <w:vAlign w:val="center"/>
+          </w:tcPr>
+          <w:p>
+            <w:pPr>
+              <w:spacing w:after="0"/>
+              <w:jc w:val="center"/>
+            </w:pPr>
+            <w:r>
+              <w:rPr>
+                <w:rFonts w:ascii="Times New Roman" w:hAnsi="Times New Roman"/>
+                <w:sz w:val="17"/>
+              </w:rPr>
+              <w:t>2.039</w:t>
+            </w:r>
+          </w:p>
+        </w:tc>
+        <w:tc>
+          <w:tcPr>
+            <w:tcW w:type="dxa" w:w="5460"/>
+            <w:tcMar>
+              <w:top w:w="80" w:type="dxa"/>
+              <w:start w:w="120" w:type="dxa"/>
+              <w:bottom w:w="80" w:type="dxa"/>
+              <w:end w:w="120" w:type="dxa"/>
+            </w:tcMar>
+            <w:vAlign w:val="center"/>
+          </w:tcPr>
+          <w:p>
+            <w:pPr>
+              <w:spacing w:after="0"/>
+              <w:jc w:val="center"/>
+            </w:pPr>
+            <w:r>
+              <w:rPr>
+                <w:rFonts w:ascii="Times New Roman" w:hAnsi="Times New Roman"/>
+                <w:sz w:val="17"/>
+              </w:rPr>
+              <w:t>0.490</w:t>
+            </w:r>
+          </w:p>
+        </w:tc>
+      </w:tr>
+      <w:tr>
+        <w:tc>
+          <w:tcPr>
+            <w:tcW w:type="dxa" w:w="2200"/>
+            <w:tcMar>
+              <w:top w:w="80" w:type="dxa"/>
+              <w:start w:w="120" w:type="dxa"/>
+              <w:bottom w:w="80" w:type="dxa"/>
+              <w:end w:w="120" w:type="dxa"/>
+            </w:tcMar>
+            <w:vAlign w:val="center"/>
+          </w:tcPr>
+          <w:p>
+            <w:pPr>
+              <w:spacing w:after="0"/>
+              <w:jc w:val="left"/>
+            </w:pPr>
+            <w:r>
+              <w:rPr>
+                <w:rFonts w:ascii="Times New Roman" w:hAnsi="Times New Roman"/>
+                <w:sz w:val="17"/>
+              </w:rPr>
+              <w:t>URG</w:t>
+            </w:r>
+          </w:p>
+        </w:tc>
+        <w:tc>
+          <w:tcPr>
+            <w:tcW w:type="dxa" w:w="1700"/>
+            <w:tcMar>
+              <w:top w:w="80" w:type="dxa"/>
+              <w:start w:w="120" w:type="dxa"/>
+              <w:bottom w:w="80" w:type="dxa"/>
+              <w:end w:w="120" w:type="dxa"/>
+            </w:tcMar>
+            <w:vAlign w:val="center"/>
+          </w:tcPr>
+          <w:p>
+            <w:pPr>
+              <w:spacing w:after="0"/>
+              <w:jc w:val="center"/>
+            </w:pPr>
+            <w:r>
+              <w:rPr>
+                <w:rFonts w:ascii="Times New Roman" w:hAnsi="Times New Roman"/>
+                <w:sz w:val="17"/>
+              </w:rPr>
+              <w:t>1.631</w:t>
+            </w:r>
+          </w:p>
+        </w:tc>
+        <w:tc>
+          <w:tcPr>
+            <w:tcW w:type="dxa" w:w="5460"/>
+            <w:tcMar>
+              <w:top w:w="80" w:type="dxa"/>
+              <w:start w:w="120" w:type="dxa"/>
+              <w:bottom w:w="80" w:type="dxa"/>
+              <w:end w:w="120" w:type="dxa"/>
+            </w:tcMar>
+            <w:vAlign w:val="center"/>
+          </w:tcPr>
+          <w:p>
+            <w:pPr>
+              <w:spacing w:after="0"/>
+              <w:jc w:val="center"/>
+            </w:pPr>
+            <w:r>
+              <w:rPr>
+                <w:rFonts w:ascii="Times New Roman" w:hAnsi="Times New Roman"/>
+                <w:sz w:val="17"/>
+              </w:rPr>
+              <w:t>0.613</w:t>
+            </w:r>
+          </w:p>
+        </w:tc>
+      </w:tr>
+    </w:tbl>
+    <w:p>
+      <w:pPr>
+        <w:pStyle w:val="TableNote"/>
+      </w:pPr>
+      <w:r>
+        <w:t>Notes: Auxiliary regressions include year indicators and exclude city indicators. Elevated VIF values for SCCD and SCCD2 are expected because the quadratic specification includes a level term and its square.</w:t>
+      </w:r>
+    </w:p>
+    <w:p>
+      <w:pPr>
+        <w:pStyle w:val="Caption"/>
+      </w:pPr>
+      <w:r>
+        <w:rPr>
+          <w:b/>
+        </w:rPr>
+        <w:t>Table S2. Joint significance tests for fixed effects in the observed baseline sample.</w:t>
+      </w:r>
+    </w:p>
+    <w:tbl>
+      <w:tblPr>
+        <w:tblStyle w:val="TableGrid"/>
+        <w:tblW w:type="dxa" w:w="9360"/>
+        <w:jc w:val="center"/>
+        <w:tblLayout w:type="fixed"/>
+        <w:tblLook w:firstColumn="1" w:firstRow="1" w:lastColumn="0" w:lastRow="0" w:noHBand="0" w:noVBand="1" w:val="04A0"/>
+        <w:tblInd w:w="120" w:type="dxa"/>
+      </w:tblPr>
+      <w:tblGrid>
+        <w:gridCol w:w="2600"/>
+        <w:gridCol w:w="1600"/>
+        <w:gridCol w:w="1200"/>
+        <w:gridCol w:w="1200"/>
+        <w:gridCol w:w="2760"/>
+      </w:tblGrid>
+      <w:tr>
+        <w:tc>
+          <w:tcPr>
+            <w:tcW w:type="dxa" w:w="2600"/>
+            <w:tcMar>
+              <w:top w:w="80" w:type="dxa"/>
+              <w:start w:w="120" w:type="dxa"/>
+              <w:bottom w:w="80" w:type="dxa"/>
+              <w:end w:w="120" w:type="dxa"/>
+            </w:tcMar>
+            <w:vAlign w:val="center"/>
+            <w:shd w:fill="F2F4F7"/>
+          </w:tcPr>
+          <w:p>
+            <w:pPr>
+              <w:spacing w:after="0"/>
+              <w:jc w:val="left"/>
+            </w:pPr>
+            <w:r>
+              <w:rPr>
+                <w:rFonts w:ascii="Times New Roman" w:hAnsi="Times New Roman"/>
+                <w:b/>
+                <w:sz w:val="17"/>
+              </w:rPr>
+              <w:t>Test</w:t>
+            </w:r>
+          </w:p>
+        </w:tc>
+        <w:tc>
+          <w:tcPr>
+            <w:tcW w:type="dxa" w:w="1600"/>
+            <w:tcMar>
+              <w:top w:w="80" w:type="dxa"/>
+              <w:start w:w="120" w:type="dxa"/>
+              <w:bottom w:w="80" w:type="dxa"/>
+              <w:end w:w="120" w:type="dxa"/>
+            </w:tcMar>
+            <w:vAlign w:val="center"/>
+            <w:shd w:fill="F2F4F7"/>
+          </w:tcPr>
+          <w:p>
+            <w:pPr>
+              <w:spacing w:after="0"/>
+              <w:jc w:val="center"/>
+            </w:pPr>
+            <w:r>
+              <w:rPr>
+                <w:rFonts w:ascii="Times New Roman" w:hAnsi="Times New Roman"/>
+                <w:b/>
+                <w:sz w:val="17"/>
+              </w:rPr>
+              <w:t>F statistic</w:t>
+            </w:r>
+          </w:p>
+        </w:tc>
+        <w:tc>
+          <w:tcPr>
+            <w:tcW w:type="dxa" w:w="1200"/>
+            <w:tcMar>
+              <w:top w:w="80" w:type="dxa"/>
+              <w:start w:w="120" w:type="dxa"/>
+              <w:bottom w:w="80" w:type="dxa"/>
+              <w:end w:w="120" w:type="dxa"/>
+            </w:tcMar>
+            <w:vAlign w:val="center"/>
+            <w:shd w:fill="F2F4F7"/>
+          </w:tcPr>
+          <w:p>
+            <w:pPr>
+              <w:spacing w:after="0"/>
+              <w:jc w:val="center"/>
+            </w:pPr>
+            <w:r>
+              <w:rPr>
+                <w:rFonts w:ascii="Times New Roman" w:hAnsi="Times New Roman"/>
+                <w:b/>
+                <w:sz w:val="17"/>
+              </w:rPr>
+              <w:t>df</w:t>
+            </w:r>
+          </w:p>
+        </w:tc>
+        <w:tc>
+          <w:tcPr>
+            <w:tcW w:type="dxa" w:w="1200"/>
+            <w:tcMar>
+              <w:top w:w="80" w:type="dxa"/>
+              <w:start w:w="120" w:type="dxa"/>
+              <w:bottom w:w="80" w:type="dxa"/>
+              <w:end w:w="120" w:type="dxa"/>
+            </w:tcMar>
+            <w:vAlign w:val="center"/>
+            <w:shd w:fill="F2F4F7"/>
+          </w:tcPr>
+          <w:p>
+            <w:pPr>
+              <w:spacing w:after="0"/>
+              <w:jc w:val="center"/>
+            </w:pPr>
+            <w:r>
+              <w:rPr>
+                <w:rFonts w:ascii="Times New Roman" w:hAnsi="Times New Roman"/>
+                <w:b/>
+                <w:sz w:val="17"/>
+              </w:rPr>
+              <w:t>df_r</w:t>
+            </w:r>
+          </w:p>
+        </w:tc>
+        <w:tc>
+          <w:tcPr>
+            <w:tcW w:type="dxa" w:w="2760"/>
+            <w:tcMar>
+              <w:top w:w="80" w:type="dxa"/>
+              <w:start w:w="120" w:type="dxa"/>
+              <w:bottom w:w="80" w:type="dxa"/>
+              <w:end w:w="120" w:type="dxa"/>
+            </w:tcMar>
+            <w:vAlign w:val="center"/>
+            <w:shd w:fill="F2F4F7"/>
+          </w:tcPr>
+          <w:p>
+            <w:pPr>
+              <w:spacing w:after="0"/>
+              <w:jc w:val="center"/>
+            </w:pPr>
+            <w:r>
+              <w:rPr>
+                <w:rFonts w:ascii="Times New Roman" w:hAnsi="Times New Roman"/>
+                <w:b/>
+                <w:sz w:val="17"/>
+              </w:rPr>
+              <w:t>p-value</w:t>
+            </w:r>
+          </w:p>
+        </w:tc>
+      </w:tr>
+      <w:tr>
+        <w:tc>
+          <w:tcPr>
+            <w:tcW w:type="dxa" w:w="2600"/>
+            <w:tcMar>
+              <w:top w:w="80" w:type="dxa"/>
+              <w:start w:w="120" w:type="dxa"/>
+              <w:bottom w:w="80" w:type="dxa"/>
+              <w:end w:w="120" w:type="dxa"/>
+            </w:tcMar>
+            <w:vAlign w:val="center"/>
+          </w:tcPr>
+          <w:p>
+            <w:pPr>
+              <w:spacing w:after="0"/>
+              <w:jc w:val="left"/>
+            </w:pPr>
+            <w:r>
+              <w:rPr>
+                <w:rFonts w:ascii="Times New Roman" w:hAnsi="Times New Roman"/>
+                <w:sz w:val="17"/>
+              </w:rPr>
+              <w:t>City fixed effects</w:t>
+            </w:r>
+          </w:p>
+        </w:tc>
+        <w:tc>
+          <w:tcPr>
+            <w:tcW w:type="dxa" w:w="1600"/>
+            <w:tcMar>
+              <w:top w:w="80" w:type="dxa"/>
+              <w:start w:w="120" w:type="dxa"/>
+              <w:bottom w:w="80" w:type="dxa"/>
+              <w:end w:w="120" w:type="dxa"/>
+            </w:tcMar>
+            <w:vAlign w:val="center"/>
+          </w:tcPr>
+          <w:p>
+            <w:pPr>
+              <w:spacing w:after="0"/>
+              <w:jc w:val="center"/>
+            </w:pPr>
+            <w:r>
+              <w:rPr>
+                <w:rFonts w:ascii="Times New Roman" w:hAnsi="Times New Roman"/>
+                <w:sz w:val="17"/>
+              </w:rPr>
+              <w:t>16.245</w:t>
+            </w:r>
+          </w:p>
+        </w:tc>
+        <w:tc>
+          <w:tcPr>
+            <w:tcW w:type="dxa" w:w="1200"/>
+            <w:tcMar>
+              <w:top w:w="80" w:type="dxa"/>
+              <w:start w:w="120" w:type="dxa"/>
+              <w:bottom w:w="80" w:type="dxa"/>
+              <w:end w:w="120" w:type="dxa"/>
+            </w:tcMar>
+            <w:vAlign w:val="center"/>
+          </w:tcPr>
+          <w:p>
+            <w:pPr>
+              <w:spacing w:after="0"/>
+              <w:jc w:val="center"/>
+            </w:pPr>
+            <w:r>
+              <w:rPr>
+                <w:rFonts w:ascii="Times New Roman" w:hAnsi="Times New Roman"/>
+                <w:sz w:val="17"/>
+              </w:rPr>
+              <w:t>283</w:t>
+            </w:r>
+          </w:p>
+        </w:tc>
+        <w:tc>
+          <w:tcPr>
+            <w:tcW w:type="dxa" w:w="1200"/>
+            <w:tcMar>
+              <w:top w:w="80" w:type="dxa"/>
+              <w:start w:w="120" w:type="dxa"/>
+              <w:bottom w:w="80" w:type="dxa"/>
+              <w:end w:w="120" w:type="dxa"/>
+            </w:tcMar>
+            <w:vAlign w:val="center"/>
+          </w:tcPr>
+          <w:p>
+            <w:pPr>
+              <w:spacing w:after="0"/>
+              <w:jc w:val="center"/>
+            </w:pPr>
+            <w:r>
+              <w:rPr>
+                <w:rFonts w:ascii="Times New Roman" w:hAnsi="Times New Roman"/>
+                <w:sz w:val="17"/>
+              </w:rPr>
+              <w:t>4209</w:t>
+            </w:r>
+          </w:p>
+        </w:tc>
+        <w:tc>
+          <w:tcPr>
+            <w:tcW w:type="dxa" w:w="2760"/>
+            <w:tcMar>
+              <w:top w:w="80" w:type="dxa"/>
+              <w:start w:w="120" w:type="dxa"/>
+              <w:bottom w:w="80" w:type="dxa"/>
+              <w:end w:w="120" w:type="dxa"/>
+            </w:tcMar>
+            <w:vAlign w:val="center"/>
+          </w:tcPr>
+          <w:p>
+            <w:pPr>
+              <w:spacing w:after="0"/>
+              <w:jc w:val="center"/>
+            </w:pPr>
+            <w:r>
+              <w:rPr>
+                <w:rFonts w:ascii="Times New Roman" w:hAnsi="Times New Roman"/>
+                <w:sz w:val="17"/>
+              </w:rPr>
+              <w:t>&lt;0.001</w:t>
+            </w:r>
+          </w:p>
+        </w:tc>
+      </w:tr>
+      <w:tr>
+        <w:tc>
+          <w:tcPr>
+            <w:tcW w:type="dxa" w:w="2600"/>
+            <w:tcMar>
+              <w:top w:w="80" w:type="dxa"/>
+              <w:start w:w="120" w:type="dxa"/>
+              <w:bottom w:w="80" w:type="dxa"/>
+              <w:end w:w="120" w:type="dxa"/>
+            </w:tcMar>
+            <w:vAlign w:val="center"/>
+          </w:tcPr>
+          <w:p>
+            <w:pPr>
+              <w:spacing w:after="0"/>
+              <w:jc w:val="left"/>
+            </w:pPr>
+            <w:r>
+              <w:rPr>
+                <w:rFonts w:ascii="Times New Roman" w:hAnsi="Times New Roman"/>
+                <w:sz w:val="17"/>
+              </w:rPr>
+              <w:t>Year fixed effects</w:t>
+            </w:r>
+          </w:p>
+        </w:tc>
+        <w:tc>
+          <w:tcPr>
+            <w:tcW w:type="dxa" w:w="1600"/>
+            <w:tcMar>
+              <w:top w:w="80" w:type="dxa"/>
+              <w:start w:w="120" w:type="dxa"/>
+              <w:bottom w:w="80" w:type="dxa"/>
+              <w:end w:w="120" w:type="dxa"/>
+            </w:tcMar>
+            <w:vAlign w:val="center"/>
+          </w:tcPr>
+          <w:p>
+            <w:pPr>
+              <w:spacing w:after="0"/>
+              <w:jc w:val="center"/>
+            </w:pPr>
+            <w:r>
+              <w:rPr>
+                <w:rFonts w:ascii="Times New Roman" w:hAnsi="Times New Roman"/>
+                <w:sz w:val="17"/>
+              </w:rPr>
+              <w:t>81.330</w:t>
+            </w:r>
+          </w:p>
+        </w:tc>
+        <w:tc>
+          <w:tcPr>
+            <w:tcW w:type="dxa" w:w="1200"/>
+            <w:tcMar>
+              <w:top w:w="80" w:type="dxa"/>
+              <w:start w:w="120" w:type="dxa"/>
+              <w:bottom w:w="80" w:type="dxa"/>
+              <w:end w:w="120" w:type="dxa"/>
+            </w:tcMar>
+            <w:vAlign w:val="center"/>
+          </w:tcPr>
+          <w:p>
+            <w:pPr>
+              <w:spacing w:after="0"/>
+              <w:jc w:val="center"/>
+            </w:pPr>
+            <w:r>
+              <w:rPr>
+                <w:rFonts w:ascii="Times New Roman" w:hAnsi="Times New Roman"/>
+                <w:sz w:val="17"/>
+              </w:rPr>
+              <w:t>15</w:t>
+            </w:r>
+          </w:p>
+        </w:tc>
+        <w:tc>
+          <w:tcPr>
+            <w:tcW w:type="dxa" w:w="1200"/>
+            <w:tcMar>
+              <w:top w:w="80" w:type="dxa"/>
+              <w:start w:w="120" w:type="dxa"/>
+              <w:bottom w:w="80" w:type="dxa"/>
+              <w:end w:w="120" w:type="dxa"/>
+            </w:tcMar>
+            <w:vAlign w:val="center"/>
+          </w:tcPr>
+          <w:p>
+            <w:pPr>
+              <w:spacing w:after="0"/>
+              <w:jc w:val="center"/>
+            </w:pPr>
+            <w:r>
+              <w:rPr>
+                <w:rFonts w:ascii="Times New Roman" w:hAnsi="Times New Roman"/>
+                <w:sz w:val="17"/>
+              </w:rPr>
+              <w:t>4209</w:t>
+            </w:r>
+          </w:p>
+        </w:tc>
+        <w:tc>
+          <w:tcPr>
+            <w:tcW w:type="dxa" w:w="2760"/>
+            <w:tcMar>
+              <w:top w:w="80" w:type="dxa"/>
+              <w:start w:w="120" w:type="dxa"/>
+              <w:bottom w:w="80" w:type="dxa"/>
+              <w:end w:w="120" w:type="dxa"/>
+            </w:tcMar>
+            <w:vAlign w:val="center"/>
+          </w:tcPr>
+          <w:p>
+            <w:pPr>
+              <w:spacing w:after="0"/>
+              <w:jc w:val="center"/>
+            </w:pPr>
+            <w:r>
+              <w:rPr>
+                <w:rFonts w:ascii="Times New Roman" w:hAnsi="Times New Roman"/>
+                <w:sz w:val="17"/>
+              </w:rPr>
+              <w:t>&lt;0.001</w:t>
+            </w:r>
+          </w:p>
+        </w:tc>
+      </w:tr>
+    </w:tbl>
+    <w:p>
+      <w:pPr>
+        <w:pStyle w:val="TableNote"/>
+      </w:pPr>
+      <w:r>
+        <w:t>Notes: Tests use a pooled OLS dummy-variable diagnostic with the baseline regressors, city indicators, and year indicators. Main estimates remain two-way fixed-effects regressions with city-clustered standard errors.</w:t>
+      </w:r>
+    </w:p>
+    <w:p>
+      <w:pPr>
         <w:pStyle w:val="Heading2"/>
       </w:pPr>
       <w:r>
@@ -11381,7 +12443,7 @@
         <w:jc w:val="both"/>
       </w:pPr>
       <w:r>
-        <w:t>The MCCD alternative proxy check asks whether the result depends on the specific SCCD construction. Any composite index can raise concerns about indicator selection and weighting. Using an alternative coordination proxy, when available in the generated table, helps show that the core curvature is not merely an artifact of one index formula. The manuscript still presents SCCD as the main variable because SCCD directly matches the production-living-ecological-digital framework developed in the theory section.</w:t>
+        <w:t>The MCCD alternative proxy check asks whether the result depends on the specific SCCD construction. Any composite index can raise concerns about indicator selection and weighting. Using an alternative coordination proxy, when available in the robustness table, helps show that the core curvature is not merely an artifact of one index formula. The manuscript still presents SCCD as the main variable because SCCD directly matches the production-living-ecological-digital framework developed in the theory section.</w:t>
       </w:r>
     </w:p>
     <w:p>
@@ -15672,7 +16734,7 @@
         <w:pStyle w:val="TableNote"/>
       </w:pPr>
       <w:r>
-        <w:t>Notes: IV estimates use the pre-existing lagged SCCD instrument and its square. First-stage and weak-instrument diagnostics are reported in the generated supplementary diagnostic files.</w:t>
+        <w:t>Notes: IV estimates use the pre-existing lagged SCCD instrument and its square. First-stage and weak-instrument diagnostics are reported in the supplementary diagnostic files.</w:t>
       </w:r>
     </w:p>
     <w:p>
@@ -15688,7 +16750,7 @@
         <w:jc w:val="both"/>
       </w:pPr>
       <w:r>
-        <w:t>Table 5 indicates that the inverted U-shaped pattern appears across major regions, but coefficient magnitudes differ. This supports H4 and implies that the same increase in coordination may have different emission implications across regional development stages. Prior DID evidence also reports spatially heterogeneous smart-city carbon effects [17]. The current paper keeps the comparison at the regional level because the workflow does not classify cities by resource-based status or estimate a resource-based-city heterogeneity table.</w:t>
+        <w:t>Table 5 indicates that the inverted U-shaped pattern appears across major regions, but coefficient magnitudes differ. This supports H4 and implies that the same increase in coordination may have different emission implications across regional development stages. Prior DID evidence also reports spatially heterogeneous smart-city carbon effects [17]. This paper keeps the comparison at the regional level because the analysis does not classify cities by resource-based status or estimate a resource-based-city heterogeneity table.</w:t>
       </w:r>
     </w:p>
     <w:p>
@@ -20447,7 +21509,7 @@
         <w:jc w:val="both"/>
       </w:pPr>
       <w:r>
-        <w:t>The DEI result gives the paper its clearest Sustainability-facing boundary condition. Digital economy development appears to weaken the marginal emission cost of coordination. This is consistent with the idea that digital capacity changes how cities use coordination. When the digital economy is weak, SCCD improvements may rely more heavily on physical expansion and administrative construction. When the digital economy is stronger, the same coordination improvement can be translated into better data sharing, energy management, service matching, and operational efficiency.</w:t>
+        <w:t>The DEI result gives the paper its clearest sustainability-relevant boundary condition. Digital economy development appears to weaken the marginal emission cost of coordination. This is consistent with the idea that digital capacity changes how cities use coordination. When the digital economy is weak, SCCD improvements may rely more heavily on physical expansion and administrative construction. When the digital economy is stronger, the same coordination improvement can be translated into better data sharing, energy management, service matching, and operational efficiency.</w:t>
       </w:r>
     </w:p>
     <w:p>
@@ -20463,7 +21525,7 @@
         <w:jc w:val="both"/>
       </w:pPr>
       <w:r>
-        <w:t>The POLY and ER estimates are included to keep the moderation workflow transparent. Polycentricity and environmental regulation are theoretically relevant to urban emissions, but the current manuscript does not make them central because the generated evidence does not support the same clear boundary-condition interpretation as DEI. This is an important writing choice. A paper becomes more credible when it emphasizes the supported result and reports weaker or supplementary results without forcing them into the main story.</w:t>
+        <w:t>The POLY and ER estimates are included to keep the moderation analysis transparent. Polycentricity and environmental regulation are theoretically relevant to urban emissions, but the manuscript does not make them central because the estimates do not support the same clear boundary-condition interpretation as DEI. This is an important writing choice. A paper becomes more credible when it emphasizes the supported result and reports weaker or supplementary results without forcing them into the main story.</w:t>
       </w:r>
     </w:p>
     <w:p>
@@ -24318,7 +25380,7 @@
         <w:jc w:val="both"/>
       </w:pPr>
       <w:r>
-        <w:t>The empirical design includes fixed effects, robustness checks, supplementary IV estimation, pathway equations, moderation models, and regional heterogeneity analysis, but it remains observational. Time-varying unobserved shocks may still affect both SCCD and emissions. Examples include local leadership changes, industrial policy packages, energy-price exposure, environmental campaigns, and unobserved infrastructure investment. The manuscript therefore describes the main result as an association. More direct causal designs would require new policy variation, event timing, or external instruments that are not generated in the current workflow.</w:t>
+        <w:t>The empirical design includes fixed effects, robustness checks, supplementary IV estimation, pathway equations, moderation models, and regional heterogeneity analysis, but it remains observational. Time-varying unobserved shocks may still affect both SCCD and emissions. Examples include local leadership changes, industrial policy packages, energy-price exposure, environmental campaigns, and unobserved infrastructure investment. The manuscript therefore describes the main result as an association. More direct causal designs would require new policy variation, event timing, or external instruments that are outside the present evidence base.</w:t>
       </w:r>
     </w:p>
     <w:p>
@@ -24326,7 +25388,7 @@
         <w:jc w:val="both"/>
       </w:pPr>
       <w:r>
-        <w:t>The observed sample ends in 2021. The broader working data file contains fitted or extrapolated 2022-2024 rows, but those rows are not part of the main evidence. This choice makes the paper more conservative but also means the manuscript does not claim to observe the most recent post-2021 city-level dynamics. Future data updates could test whether the nonlinear pattern persists as more observed years become available, especially after major changes in digital infrastructure, energy policy, and urban governance.</w:t>
+        <w:t>The observed sample ends in 2021. The broader analytical file contains fitted or extrapolated 2022-2024 rows, but those rows are not part of the main evidence. This choice makes the paper more conservative but also means the manuscript does not claim to observe the most recent post-2021 city-level dynamics. Future data updates could test whether the nonlinear pattern persists as more observed years become available, especially after major changes in digital infrastructure, energy policy, and urban governance.</w:t>
       </w:r>
     </w:p>
     <w:p>
@@ -24334,7 +25396,7 @@
         <w:jc w:val="both"/>
       </w:pPr>
       <w:r>
-        <w:t>A related limitation concerns the interpretation of regional evidence. The current data classify cities into eastern, central, and western regions only. The manuscript therefore does not estimate a separate northeastern model and does not claim region-specific coefficients for a northeastern subsample. This matters because regional language can otherwise outrun the generated tables. The heterogeneity discussion is intentionally limited to the categories that appear in the Stata data and in the exported regional tables.</w:t>
+        <w:t>A related limitation concerns the interpretation of regional evidence. The current data classify cities into eastern, central, and western regions only. The manuscript therefore does not estimate a separate northeastern model and does not claim region-specific coefficients for a northeastern subsample. This matters because regional language can otherwise outrun the exported tables. The heterogeneity discussion is intentionally limited to the categories that appear in the Stata data and in the exported regional tables.</w:t>
       </w:r>
     </w:p>
     <w:p>
@@ -24350,7 +25412,7 @@
         <w:jc w:val="both"/>
       </w:pPr>
       <w:r>
-        <w:t>These limits shape how the tables are used in the paper. The baseline, robustness, heterogeneity, associated-pathway, and moderation outputs are not separate stories competing for attention. They are checks around one central empirical pattern. The baseline table establishes the nonlinear association; the robustness table asks whether the pattern is fragile; the regional table asks whether the pattern is spatially uniform; the pathway equations ask which restructuring variables move with SCCD; and the moderation table asks whether digital economy capacity changes the marginal relationship. Reading the tables this way keeps the interpretation coherent and prevents stronger causal or regional claims than the generated evidence supports. This table-by-table discipline is especially important for a manuscript built from generated empirical outputs.</w:t>
+        <w:t>These limits shape how the tables are used in the paper. The baseline, robustness, heterogeneity, associated-pathway, and moderation outputs are not separate stories competing for attention. They are checks around one central empirical pattern. The baseline table establishes the nonlinear association. The robustness table asks whether the pattern is fragile. The regional table asks whether the pattern is spatially uniform. The pathway equations ask which restructuring variables move with SCCD. The moderation table asks whether digital economy capacity changes the marginal relationship. Reading the tables this way keeps the interpretation coherent and prevents stronger causal or regional claims than the exported evidence supports. This table-by-table discipline is especially important for a manuscript built from auditable empirical outputs.</w:t>
       </w:r>
     </w:p>
     <w:p>
@@ -24358,7 +25420,7 @@
         <w:jc w:val="both"/>
       </w:pPr>
       <w:r>
-        <w:t>Finally, the empirical result is a city-level average relationship, not a project-level assessment tool. A city below the estimated turning point may still contain specific smart projects that reduce emissions, while a city above the turning point may still approve projects with high embodied carbon or rebound effects. The policy value of the curve is to warn against one-size-fits-all smart-city claims. It does not replace project appraisal, energy accounting, or sector-specific monitoring. Future work could connect SCCD changes to project inventories, transport data, digital infrastructure energy use, and firm-level upgrading to explain more precisely which parts of coordination create short-run pressure and which parts generate durable efficiency gains.</w:t>
+        <w:t>Finally, the empirical result is a city-level average relationship, not a project-level assessment tool. A city below the estimated turning point may still contain specific smart projects that reduce emissions, while a city above the turning point may still approve projects with high embodied carbon or rebound effects. The policy value of the curve is to warn against one-size-fits-all smart-city claims. It does not replace project appraisal, energy accounting, or sector-specific monitoring. Future work could connect SCCD changes to project inventories, transport data, digital infrastructure energy use, and firm-level upgrading. That evidence would show more precisely which parts of coordination create short-run pressure and which parts generate durable efficiency gains.</w:t>
       </w:r>
     </w:p>
     <w:p>
@@ -24406,7 +25468,7 @@
         <w:jc w:val="both"/>
       </w:pPr>
       <w:r>
-        <w:t>Future research should build richer measures of digital urban governance, distinguish construction-phase and operation-phase smart-city investment, examine longer dynamic lags in industrial upgrading and green innovation, and test whether the SCCD framework travels to other national and metropolitan contexts. New observed data after 2021 would also allow the author team to test whether the turning point changes as digital governance matures and as low-carbon policy constraints tighten.</w:t>
+        <w:t>Future research should build richer measures of digital urban governance and distinguish construction-phase from operation-phase smart-city investment. It should also examine longer dynamic lags in industrial upgrading and green innovation and test whether the SCCD framework travels to other national and metropolitan contexts. New observed data after 2021 would allow researchers to test whether the turning point changes as digital governance matures and as low-carbon policy constraints tighten.</w:t>
       </w:r>
     </w:p>
     <w:p>
@@ -24422,7 +25484,7 @@
         <w:jc w:val="both"/>
       </w:pPr>
       <w:r>
-        <w:t>The working files used to generate this analytical manuscript did not contain final CRediT roles. The author team must finalize this statement against the named author list before journal submission.</w:t>
+        <w:t>Author contribution roles are pending final author confirmation. The final statement should use the CRediT taxonomy and assign author initials to each applicable role. Relevant roles include conceptualization, methodology, software, validation, formal analysis, investigation, resources, data curation, writing-original draft preparation, writing-review and editing, visualization, supervision, project administration, and funding acquisition. All authors should read and agree to the published version of the manuscript.</w:t>
       </w:r>
     </w:p>
     <w:p>
@@ -24438,7 +25500,7 @@
         <w:jc w:val="both"/>
       </w:pPr>
       <w:r>
-        <w:t>Funding metadata were not available in the working files used to generate this analytical manuscript. The final submission must state the funder name and grant number, or formally state that the research received no external funding.</w:t>
+        <w:t>Funding information is pending final author confirmation. The final statement must list funder names and grant numbers, or state that the research received no external funding.</w:t>
       </w:r>
     </w:p>
     <w:p>
@@ -24486,7 +25548,7 @@
         <w:jc w:val="both"/>
       </w:pPr>
       <w:r>
-        <w:t>The Stata do-files, Python generation script, generated tables, and generated figures can be made available in a public replication repository. The raw and processed city-level analytical data draw on statistical yearbooks, EDGAR products, and third-party enterprise-query data; redistribution may be limited by source licensing. Data can therefore be provided by the authors upon reasonable request where source licenses permit.</w:t>
+        <w:t>The Stata analysis scripts, exported tables, and exported figures can be made available in a public replication repository. The raw and processed city-level analytical data draw on statistical yearbooks, EDGAR products, and third-party enterprise-query data; redistribution may be limited by source licensing. Data can therefore be provided by the authors upon reasonable request where source licenses permit.</w:t>
       </w:r>
     </w:p>
     <w:p>
@@ -24502,7 +25564,23 @@
         <w:jc w:val="both"/>
       </w:pPr>
       <w:r>
-        <w:t>No acknowledgement text was available in the working files used to generate this analytical manuscript.</w:t>
+        <w:t>Acknowledgment text is pending final author confirmation. The final statement should acknowledge non-author support where applicable or state that acknowledgments are not applicable.</w:t>
+      </w:r>
+    </w:p>
+    <w:p>
+      <w:pPr>
+        <w:pStyle w:val="Heading1"/>
+      </w:pPr>
+      <w:r>
+        <w:t>Declaration of Generative AI and AI-Assisted Technologies in the Writing Process</w:t>
+      </w:r>
+    </w:p>
+    <w:p>
+      <w:pPr>
+        <w:jc w:val="both"/>
+      </w:pPr>
+      <w:r>
+        <w:t>During manuscript preparation, AI-assisted tools were used for language polishing, structural editing, and formatting support. The authors reviewed and edited the content and take full responsibility for the published article.</w:t>
       </w:r>
     </w:p>
     <w:p>
@@ -24518,7 +25596,7 @@
         <w:jc w:val="both"/>
       </w:pPr>
       <w:r>
-        <w:t>Conflict-of-interest metadata were not available in the working files used to generate this analytical manuscript. The final submission must include the author team's formal conflict-of-interest declaration.</w:t>
+        <w:t>The conflict-of-interest declaration is pending final author confirmation. The final statement must disclose any competing interests or state that the authors declare no conflicts of interest.</w:t>
       </w:r>
     </w:p>
     <w:p>
@@ -24534,7 +25612,7 @@
         <w:jc w:val="both"/>
       </w:pPr>
       <w:r>
-        <w:t>The supplementary evidence generated for this revision includes the observed-sample U-test output, IV diagnostics, DEI conditional turning-point calculations, OPEN data-quality diagnostic, full 2006-2024 fitted/extrapolated sensitivity tables, and the code used to generate tables and figures. The 2022-2024 fitted or extrapolated observations are supplementary sensitivity evidence and are not observed statistical records.</w:t>
+        <w:t>The supplementary materials are organized into main-analysis and sensitivity-analysis files. Main-analysis materials include the observed-sample U-test output, IV diagnostics, VIF table, fixed-effect joint tests, DEI conditional turning-point calculations, OPEN data-quality diagnostic, observed-sample tables, and observed-sample figures. Sensitivity-analysis materials include full 2006-2024 fitted/extrapolated tables, full-sample figures, panel coverage files, and code. The 2022-2024 fitted or extrapolated observations are supplementary sensitivity evidence and are not observed statistical records.</w:t>
       </w:r>
     </w:p>
     <w:p>

</xml_diff>